<commit_message>
Part 6 commit 1
</commit_message>
<xml_diff>
--- a/products/manuscript/manuscript.docx
+++ b/products/manuscript/manuscript.docx
@@ -180,7 +180,7 @@
         <w:pStyle w:val="FirstParagraph"/>
       </w:pPr>
       <w:r>
-        <w:t xml:space="preserve">H-1B is a nonimmigrant visa category that allows employers to hire foreign workers in specialty occupations, like methematics, engineering, technology, and medical sciences</w:t>
+        <w:t xml:space="preserve">The H-1B visa program, established by the Immigration Act of 1990, allows U.S. employers to hire foreign nationals in specialty occupations that require theoretical or technical expertise, typically in fields such as engineering, computer science, healthcare, and finance. Each fiscal year, the U.S. Citizenship and Immigration Services (USCIS) allocates 65,000 H-1B visas, with an additional 20,000 visas reserved specifically for candidates holding advanced degrees from U.S. institutions. Due to persistently high demand surpassing the available visa quota, USCIS employs a lottery selection system to determine which eligible applications may proceed</w:t>
       </w:r>
       <w:r>
         <w:t xml:space="preserve"> </w:t>
@@ -189,7 +189,15 @@
         <w:t xml:space="preserve">(1)</w:t>
       </w:r>
       <w:r>
-        <w:t xml:space="preserve">. It requires the employee to have a bachelor’s degree or equivalent in the specific specialty. Typically, the maximun duration of an H-1B visa is six years.It is the most common work visa in the US. There are 65,000 available H-1B visas each year, with 20,000 additional visas for candidates with a master’s or doctorate degree from a U.S. institution. If there are more than 65,000 applications, USCIS will run a lottery to decide who can file an H-1B petition. As USCIS is receiving more and more H-1B registration these years, it’s harder for a foreign worker to get an H-1B visa. The Labor Condition Application (LCA) is an application filed by employers to apply for work authorization on behalf of employees as a prerequisite for H-1B. The LCA contains essential details such as job title, wage, and location about the proposed H-1B employment. Therefore, analyzing the LCA data can provide some ideas on the H-1B application status</w:t>
+        <w:t xml:space="preserve">.</w:t>
+      </w:r>
+    </w:p>
+    <w:p>
+      <w:pPr>
+        <w:pStyle w:val="BodyText"/>
+      </w:pPr>
+      <w:r>
+        <w:t xml:space="preserve">Before submitting an H-1B petition, employers must file a Labor Condition Application (LCA) with the U.S. Department of Labor (DOL). The LCA certifies that the employer will pay the prevailing wage and maintain working conditions that do not adversely affect U.S. workers. Essential details such as job title, wage offered, and work location are included in the LCA, making it a valuable source for analyzing employment trends, wage distributions, and geographical patterns within the H-1B program</w:t>
       </w:r>
       <w:r>
         <w:t xml:space="preserve"> </w:t>
@@ -199,6 +207,40 @@
       </w:r>
       <w:r>
         <w:t xml:space="preserve">.</w:t>
+      </w:r>
+    </w:p>
+    <w:p>
+      <w:pPr>
+        <w:pStyle w:val="BodyText"/>
+      </w:pPr>
+      <w:r>
+        <w:t xml:space="preserve">Previous studies has examined the economic impacts and employment trends associated with the H-1B visa. Ke and Qiao used machine learning techniques on LCA data (2008–2018) to uncover key factors influencing salary levels and application outcomes, showing higher wages correlated strongly with specific job categories and industries such as healthcare and technology</w:t>
+      </w:r>
+      <w:r>
+        <w:t xml:space="preserve"> </w:t>
+      </w:r>
+      <w:r>
+        <w:t xml:space="preserve">(3)</w:t>
+      </w:r>
+      <w:r>
+        <w:t xml:space="preserve">. Similarly, Dombe et al. applied deep-learning methods to predict H-1B approval outcomes, demonstrating that complex modeling approaches significantly enhance prediction accuracy</w:t>
+      </w:r>
+      <w:r>
+        <w:t xml:space="preserve"> </w:t>
+      </w:r>
+      <w:r>
+        <w:t xml:space="preserve">(4)</w:t>
+      </w:r>
+      <w:r>
+        <w:t xml:space="preserve">.</w:t>
+      </w:r>
+    </w:p>
+    <w:p>
+      <w:pPr>
+        <w:pStyle w:val="BodyText"/>
+      </w:pPr>
+      <w:r>
+        <w:t xml:space="preserve">Despite this growing body of work, there remains a gap in recent and comprehensive analyses that incorporate employment trends, remote work patterns, and advanced predictive modeling, especially after the labor practices have altered due to the pandemic. To address these gaps, this project analyzes certified H-1B visa cases from 2020 to 2024 using recent LCA disclosure data. This period encompasses major shifts in employment practices brought by the pandemic, providing timely insights into changes within the H-1B landscape. Specifically, the project investigates wage distributions, geographical variations, and remote work trends, combining descriptive analysis with sophisticated predictive modeling techniques (Random Forest, XGBoost, Support Vector Machines). The results provide essential baseline information for policymakers, businesses, and researchers aiming to understand the current and future patterns of high-skilled international labor in the U.S.</w:t>
       </w:r>
     </w:p>
     <w:bookmarkEnd w:id="21"/>
@@ -2593,7 +2635,7 @@
       </w:r>
     </w:p>
     <w:bookmarkEnd w:id="63"/>
-    <w:bookmarkStart w:id="67" w:name="references"/>
+    <w:bookmarkStart w:id="70" w:name="references"/>
     <w:p>
       <w:pPr>
         <w:pStyle w:val="Heading1"/>
@@ -2602,7 +2644,7 @@
         <w:t xml:space="preserve">7. References</w:t>
       </w:r>
     </w:p>
-    <w:bookmarkStart w:id="66" w:name="refs"/>
+    <w:bookmarkStart w:id="69" w:name="refs"/>
     <w:bookmarkStart w:id="64" w:name="ref-H1BVisaProgram2016"/>
     <w:p>
       <w:pPr>
@@ -2714,8 +2756,100 @@
       </w:r>
     </w:p>
     <w:bookmarkEnd w:id="65"/>
-    <w:bookmarkEnd w:id="66"/>
+    <w:bookmarkStart w:id="67" w:name="ref-ke2019getsjobpaidmachine"/>
+    <w:p>
+      <w:pPr>
+        <w:pStyle w:val="Bibliography"/>
+      </w:pPr>
+      <w:r>
+        <w:t xml:space="preserve">3.</w:t>
+      </w:r>
+      <w:r>
+        <w:t xml:space="preserve"> </w:t>
+      </w:r>
+      <w:r>
+        <w:t xml:space="preserve">	</w:t>
+      </w:r>
+      <w:r>
+        <w:t xml:space="preserve">Ke B, Qiao A. Who gets the job and how are they paid?</w:t>
+      </w:r>
+      <w:r>
+        <w:t xml:space="preserve"> </w:t>
+      </w:r>
+      <w:r>
+        <w:t xml:space="preserve">Machine</w:t>
+      </w:r>
+      <w:r>
+        <w:t xml:space="preserve"> </w:t>
+      </w:r>
+      <w:r>
+        <w:t xml:space="preserve">learning application on h-</w:t>
+      </w:r>
+      <w:r>
+        <w:t xml:space="preserve">1B</w:t>
+      </w:r>
+      <w:r>
+        <w:t xml:space="preserve"> </w:t>
+      </w:r>
+      <w:r>
+        <w:t xml:space="preserve">case data. 2019;(</w:t>
+      </w:r>
+      <w:hyperlink r:id="rId66">
+        <w:r>
+          <w:rPr>
+            <w:rStyle w:val="Hyperlink"/>
+          </w:rPr>
+          <w:t xml:space="preserve">https://arxiv.org/abs/1904.10580</w:t>
+        </w:r>
+      </w:hyperlink>
+      <w:r>
+        <w:t xml:space="preserve">)</w:t>
+      </w:r>
+    </w:p>
     <w:bookmarkEnd w:id="67"/>
+    <w:bookmarkStart w:id="68" w:name="ref-Dombe2020ADL"/>
+    <w:p>
+      <w:pPr>
+        <w:pStyle w:val="Bibliography"/>
+      </w:pPr>
+      <w:r>
+        <w:t xml:space="preserve">4.</w:t>
+      </w:r>
+      <w:r>
+        <w:t xml:space="preserve"> </w:t>
+      </w:r>
+      <w:r>
+        <w:t xml:space="preserve">	</w:t>
+      </w:r>
+      <w:r>
+        <w:t xml:space="preserve">Dombe A, Rewale R, Swain D. A deep learning-based approach for predicting the outcome of h-</w:t>
+      </w:r>
+      <w:r>
+        <w:t xml:space="preserve">1B</w:t>
+      </w:r>
+      <w:r>
+        <w:t xml:space="preserve"> </w:t>
+      </w:r>
+      <w:r>
+        <w:t xml:space="preserve">visa application.</w:t>
+      </w:r>
+      <w:r>
+        <w:t xml:space="preserve"> </w:t>
+      </w:r>
+      <w:r>
+        <w:rPr>
+          <w:i/>
+          <w:iCs/>
+        </w:rPr>
+        <w:t xml:space="preserve">Machine Learning and Information Processing</w:t>
+      </w:r>
+      <w:r>
+        <w:t xml:space="preserve">. 2020;</w:t>
+      </w:r>
+    </w:p>
+    <w:bookmarkEnd w:id="68"/>
+    <w:bookmarkEnd w:id="69"/>
+    <w:bookmarkEnd w:id="70"/>
     <w:sectPr/>
   </w:body>
 </w:document>

</xml_diff>